<commit_message>
Deploying to gh-pages from @ UCD-SERG/qbt@53ab575b6dff0f7bcdb846cc0246ad9fd4653743 🚀
</commit_message>
<xml_diff>
--- a/Your-Book-Title.docx
+++ b/Your-Book-Title.docx
@@ -23,10 +23,10 @@
         <w:pStyle w:val="Date"/>
       </w:pPr>
       <w:r>
-        <w:t xml:space="preserve">Last updated: 2026-02-05</w:t>
-      </w:r>
-    </w:p>
-    <w:bookmarkStart w:id="26" w:name="welcome"/>
+        <w:t xml:space="preserve">Last updated: 2026-04-23</w:t>
+      </w:r>
+    </w:p>
+    <w:bookmarkStart w:id="15" w:name="welcome"/>
     <w:p>
       <w:pPr>
         <w:pStyle w:val="Heading1"/>
@@ -43,7 +43,7 @@
         <w:t xml:space="preserve">This is a Quarto book template that you can use to create your own book.</w:t>
       </w:r>
     </w:p>
-    <w:bookmarkStart w:id="21" w:name="about-this-book"/>
+    <w:bookmarkStart w:id="10" w:name="about-this-book"/>
     <w:p>
       <w:pPr>
         <w:pStyle w:val="Heading2"/>
@@ -62,7 +62,7 @@
       <w:r>
         <w:t xml:space="preserve"> </w:t>
       </w:r>
-      <w:hyperlink r:id="rId20">
+      <w:hyperlink r:id="rId9">
         <w:r>
           <w:rPr>
             <w:rStyle w:val="Hyperlink"/>
@@ -74,8 +74,8 @@
         <w:t xml:space="preserve">, an open-source scientific and technical publishing system. You can use Quarto to create books, websites, blogs, presentations, and more from markdown files.</w:t>
       </w:r>
     </w:p>
-    <w:bookmarkEnd w:id="21"/>
-    <w:bookmarkStart w:id="22" w:name="getting-started"/>
+    <w:bookmarkEnd w:id="10"/>
+    <w:bookmarkStart w:id="11" w:name="getting-started"/>
     <w:p>
       <w:pPr>
         <w:pStyle w:val="Heading2"/>
@@ -251,8 +251,8 @@
         <w:t xml:space="preserve">with your citations.</w:t>
       </w:r>
     </w:p>
-    <w:bookmarkEnd w:id="22"/>
-    <w:bookmarkStart w:id="23" w:name="building-the-book"/>
+    <w:bookmarkEnd w:id="11"/>
+    <w:bookmarkStart w:id="12" w:name="building-the-book"/>
     <w:p>
       <w:pPr>
         <w:pStyle w:val="Heading2"/>
@@ -334,8 +334,8 @@
         <w:t xml:space="preserve">directory, which can be published to GitHub Pages.</w:t>
       </w:r>
     </w:p>
-    <w:bookmarkEnd w:id="23"/>
-    <w:bookmarkStart w:id="24" w:name="publishing-to-github-pages"/>
+    <w:bookmarkEnd w:id="12"/>
+    <w:bookmarkStart w:id="13" w:name="publishing-to-github-pages"/>
     <w:p>
       <w:pPr>
         <w:pStyle w:val="Heading2"/>
@@ -464,8 +464,8 @@
         <w:t xml:space="preserve">https://YOUR-USERNAME.github.io/YOUR-REPO/</w:t>
       </w:r>
     </w:p>
-    <w:bookmarkEnd w:id="24"/>
-    <w:bookmarkStart w:id="25" w:name="license"/>
+    <w:bookmarkEnd w:id="13"/>
+    <w:bookmarkStart w:id="14" w:name="license"/>
     <w:p>
       <w:pPr>
         <w:pStyle w:val="Heading2"/>
@@ -482,9 +482,9 @@
         <w:t xml:space="preserve">Add your license information here.</w:t>
       </w:r>
     </w:p>
-    <w:bookmarkEnd w:id="25"/>
-    <w:bookmarkEnd w:id="26"/>
-    <w:bookmarkStart w:id="31" w:name="chapter-1-introduction"/>
+    <w:bookmarkEnd w:id="14"/>
+    <w:bookmarkEnd w:id="15"/>
+    <w:bookmarkStart w:id="20" w:name="chapter-1-introduction"/>
     <w:p>
       <w:pPr>
         <w:pStyle w:val="Heading1"/>
@@ -501,7 +501,7 @@
         <w:t xml:space="preserve">This is the first chapter of your book. Replace this content with your own.</w:t>
       </w:r>
     </w:p>
-    <w:bookmarkStart w:id="28" w:name="section-1.1"/>
+    <w:bookmarkStart w:id="17" w:name="section-1.1"/>
     <w:p>
       <w:pPr>
         <w:pStyle w:val="Heading2"/>
@@ -518,7 +518,7 @@
         <w:t xml:space="preserve">Add your content here.</w:t>
       </w:r>
     </w:p>
-    <w:bookmarkStart w:id="27" w:name="subsection-1.1.1"/>
+    <w:bookmarkStart w:id="16" w:name="subsection-1.1.1"/>
     <w:p>
       <w:pPr>
         <w:pStyle w:val="Heading3"/>
@@ -624,7 +624,7 @@
       <w:r>
         <w:t xml:space="preserve"> </w:t>
       </w:r>
-      <w:hyperlink r:id="rId20">
+      <w:hyperlink r:id="rId9">
         <w:r>
           <w:rPr>
             <w:rStyle w:val="Hyperlink"/>
@@ -633,9 +633,9 @@
         </w:r>
       </w:hyperlink>
     </w:p>
-    <w:bookmarkEnd w:id="27"/>
-    <w:bookmarkEnd w:id="28"/>
-    <w:bookmarkStart w:id="29" w:name="section-1.2"/>
+    <w:bookmarkEnd w:id="16"/>
+    <w:bookmarkEnd w:id="17"/>
+    <w:bookmarkStart w:id="18" w:name="section-1.2"/>
     <w:p>
       <w:pPr>
         <w:pStyle w:val="Heading2"/>
@@ -865,8 +865,8 @@
         <w:t xml:space="preserve">()</w:t>
       </w:r>
     </w:p>
-    <w:bookmarkEnd w:id="29"/>
-    <w:bookmarkStart w:id="30" w:name="section-1.3"/>
+    <w:bookmarkEnd w:id="18"/>
+    <w:bookmarkStart w:id="19" w:name="section-1.3"/>
     <w:p>
       <w:pPr>
         <w:pStyle w:val="Heading2"/>
@@ -913,9 +913,9 @@
         <w:t xml:space="preserve">file.</w:t>
       </w:r>
     </w:p>
-    <w:bookmarkEnd w:id="30"/>
-    <w:bookmarkEnd w:id="31"/>
-    <w:bookmarkStart w:id="49" w:name="chapter-2-advanced-topics"/>
+    <w:bookmarkEnd w:id="19"/>
+    <w:bookmarkEnd w:id="20"/>
+    <w:bookmarkStart w:id="38" w:name="chapter-2-advanced-topics"/>
     <w:p>
       <w:pPr>
         <w:pStyle w:val="Heading1"/>
@@ -932,7 +932,7 @@
         <w:t xml:space="preserve">This is the second chapter. Continue building your book with more chapters.</w:t>
       </w:r>
     </w:p>
-    <w:bookmarkStart w:id="32" w:name="mathematical-equations"/>
+    <w:bookmarkStart w:id="21" w:name="mathematical-equations"/>
     <w:p>
       <w:pPr>
         <w:pStyle w:val="Heading2"/>
@@ -1088,8 +1088,8 @@
         </m:oMath>
       </m:oMathPara>
     </w:p>
-    <w:bookmarkEnd w:id="32"/>
-    <w:bookmarkStart w:id="34" w:name="tables"/>
+    <w:bookmarkEnd w:id="21"/>
+    <w:bookmarkStart w:id="23" w:name="tables"/>
     <w:p>
       <w:pPr>
         <w:pStyle w:val="Heading2"/>
@@ -1111,7 +1111,7 @@
       <w:tr>
         <w:tc>
           <w:tcPr/>
-          <w:bookmarkStart w:id="33" w:name="tbl-example"/>
+          <w:bookmarkStart w:id="22" w:name="tbl-example"/>
           <w:p>
             <w:pPr>
               <w:jc w:val="center"/>
@@ -1254,13 +1254,13 @@
               </w:tc>
             </w:tr>
           </w:tbl>
-          <w:bookmarkEnd w:id="33"/>
+          <w:bookmarkEnd w:id="22"/>
           <w:p/>
         </w:tc>
       </w:tr>
     </w:tbl>
-    <w:bookmarkEnd w:id="34"/>
-    <w:bookmarkStart w:id="35" w:name="figures"/>
+    <w:bookmarkEnd w:id="23"/>
+    <w:bookmarkStart w:id="24" w:name="figures"/>
     <w:p>
       <w:pPr>
         <w:pStyle w:val="Heading2"/>
@@ -1329,8 +1329,8 @@
         <w:t xml:space="preserve">.</w:t>
       </w:r>
     </w:p>
-    <w:bookmarkEnd w:id="35"/>
-    <w:bookmarkStart w:id="48" w:name="callouts"/>
+    <w:bookmarkEnd w:id="24"/>
+    <w:bookmarkStart w:id="37" w:name="callouts"/>
     <w:p>
       <w:pPr>
         <w:pStyle w:val="Heading2"/>
@@ -1380,18 +1380,18 @@
                 <wp:inline>
                   <wp:extent cx="152400" cy="152400"/>
                   <wp:effectExtent b="0" l="0" r="0" t="0"/>
-                  <wp:docPr descr="" title="" id="37" name="Picture"/>
+                  <wp:docPr descr="" title="" id="26" name="Picture"/>
                   <a:graphic>
                     <a:graphicData uri="http://schemas.openxmlformats.org/drawingml/2006/picture">
                       <pic:pic>
                         <pic:nvPicPr>
-                          <pic:cNvPr descr="/opt/quarto/share/formats/docx/note.png" id="38" name="Picture"/>
+                          <pic:cNvPr descr="/opt/quarto/share/formats/docx/note.png" id="27" name="Picture"/>
                           <pic:cNvPicPr>
                             <a:picLocks noChangeArrowheads="1" noChangeAspect="1"/>
                           </pic:cNvPicPr>
                         </pic:nvPicPr>
                         <pic:blipFill>
-                          <a:blip r:embed="rId36"/>
+                          <a:blip r:embed="rId25"/>
                           <a:stretch>
                             <a:fillRect/>
                           </a:stretch>
@@ -1504,18 +1504,18 @@
                 <wp:inline>
                   <wp:extent cx="152400" cy="152400"/>
                   <wp:effectExtent b="0" l="0" r="0" t="0"/>
-                  <wp:docPr descr="" title="" id="40" name="Picture"/>
+                  <wp:docPr descr="" title="" id="29" name="Picture"/>
                   <a:graphic>
                     <a:graphicData uri="http://schemas.openxmlformats.org/drawingml/2006/picture">
                       <pic:pic>
                         <pic:nvPicPr>
-                          <pic:cNvPr descr="/opt/quarto/share/formats/docx/tip.png" id="41" name="Picture"/>
+                          <pic:cNvPr descr="/opt/quarto/share/formats/docx/tip.png" id="30" name="Picture"/>
                           <pic:cNvPicPr>
                             <a:picLocks noChangeArrowheads="1" noChangeAspect="1"/>
                           </pic:cNvPicPr>
                         </pic:nvPicPr>
                         <pic:blipFill>
-                          <a:blip r:embed="rId39"/>
+                          <a:blip r:embed="rId28"/>
                           <a:stretch>
                             <a:fillRect/>
                           </a:stretch>
@@ -1628,18 +1628,18 @@
                 <wp:inline>
                   <wp:extent cx="152400" cy="152400"/>
                   <wp:effectExtent b="0" l="0" r="0" t="0"/>
-                  <wp:docPr descr="" title="" id="43" name="Picture"/>
+                  <wp:docPr descr="" title="" id="32" name="Picture"/>
                   <a:graphic>
                     <a:graphicData uri="http://schemas.openxmlformats.org/drawingml/2006/picture">
                       <pic:pic>
                         <pic:nvPicPr>
-                          <pic:cNvPr descr="/opt/quarto/share/formats/docx/warning.png" id="44" name="Picture"/>
+                          <pic:cNvPr descr="/opt/quarto/share/formats/docx/warning.png" id="33" name="Picture"/>
                           <pic:cNvPicPr>
                             <a:picLocks noChangeArrowheads="1" noChangeAspect="1"/>
                           </pic:cNvPicPr>
                         </pic:nvPicPr>
                         <pic:blipFill>
-                          <a:blip r:embed="rId42"/>
+                          <a:blip r:embed="rId31"/>
                           <a:stretch>
                             <a:fillRect/>
                           </a:stretch>
@@ -1752,18 +1752,18 @@
                 <wp:inline>
                   <wp:extent cx="152400" cy="152400"/>
                   <wp:effectExtent b="0" l="0" r="0" t="0"/>
-                  <wp:docPr descr="" title="" id="46" name="Picture"/>
+                  <wp:docPr descr="" title="" id="35" name="Picture"/>
                   <a:graphic>
                     <a:graphicData uri="http://schemas.openxmlformats.org/drawingml/2006/picture">
                       <pic:pic>
                         <pic:nvPicPr>
-                          <pic:cNvPr descr="/opt/quarto/share/formats/docx/important.png" id="47" name="Picture"/>
+                          <pic:cNvPr descr="/opt/quarto/share/formats/docx/important.png" id="36" name="Picture"/>
                           <pic:cNvPicPr>
                             <a:picLocks noChangeArrowheads="1" noChangeAspect="1"/>
                           </pic:cNvPicPr>
                         </pic:nvPicPr>
                         <pic:blipFill>
-                          <a:blip r:embed="rId45"/>
+                          <a:blip r:embed="rId34"/>
                           <a:stretch>
                             <a:fillRect/>
                           </a:stretch>
@@ -1827,9 +1827,9 @@
         </w:tc>
       </w:tr>
     </w:tbl>
-    <w:bookmarkEnd w:id="48"/>
-    <w:bookmarkEnd w:id="49"/>
-    <w:bookmarkStart w:id="51" w:name="references"/>
+    <w:bookmarkEnd w:id="37"/>
+    <w:bookmarkEnd w:id="38"/>
+    <w:bookmarkStart w:id="40" w:name="references"/>
     <w:p>
       <w:pPr>
         <w:pStyle w:val="Heading1"/>
@@ -1838,9 +1838,9 @@
         <w:t xml:space="preserve">References</w:t>
       </w:r>
     </w:p>
-    <w:bookmarkStart w:id="50" w:name="refs"/>
-    <w:bookmarkEnd w:id="50"/>
-    <w:bookmarkEnd w:id="51"/>
+    <w:bookmarkStart w:id="39" w:name="refs"/>
+    <w:bookmarkEnd w:id="39"/>
+    <w:bookmarkEnd w:id="40"/>
     <w:sectPr>
       <w:footnotePr>
         <w:numRestart w:val="eachSect"/>
@@ -2213,10 +2213,10 @@
   <w:docDefaults>
     <w:rPrDefault>
       <w:rPr>
-        <w:rFonts w:asciiTheme="minorHAnsi" w:cstheme="minorBidi" w:eastAsiaTheme="minorHAnsi" w:hAnsiTheme="minorHAnsi"/>
+        <w:rFonts w:asciiTheme="minorHAnsi" w:cstheme="minorBidi" w:eastAsiaTheme="minorEastAsia" w:hAnsiTheme="minorHAnsi"/>
         <w:sz w:val="24"/>
         <w:szCs w:val="24"/>
-        <w:lang w:bidi="ar-SA" w:eastAsia="en-US" w:val="en-US"/>
+        <w:lang w:bidi="ar-SA" w:eastAsia="zh-CN" w:val="en-US"/>
       </w:rPr>
     </w:rPrDefault>
     <w:pPrDefault>
@@ -2757,13 +2757,6 @@
       </w:tblCellMar>
     </w:tblPr>
     <w:tblStylePr w:type="firstRow">
-      <w:tblPr>
-        <w:jc w:val="left"/>
-        <w:tblInd w:type="dxa" w:w="0"/>
-      </w:tblPr>
-      <w:trPr>
-        <w:jc w:val="left"/>
-      </w:trPr>
       <w:tcPr>
         <w:tcBorders>
           <w:bottom w:val="single"/>

</xml_diff>

<commit_message>
Deploying to gh-pages from @ UCD-SERG/qbt@cef020b0c5b46d8ee2147a98f89b674e37efdf06 🚀
</commit_message>
<xml_diff>
--- a/Your-Book-Title.docx
+++ b/Your-Book-Title.docx
@@ -23,7 +23,7 @@
         <w:pStyle w:val="Date"/>
       </w:pPr>
       <w:r>
-        <w:t xml:space="preserve">Last updated: 2026-04-23</w:t>
+        <w:t xml:space="preserve">Last updated: 2026-05-04</w:t>
       </w:r>
     </w:p>
     <w:bookmarkStart w:id="15" w:name="welcome"/>
@@ -915,7 +915,7 @@
     </w:p>
     <w:bookmarkEnd w:id="19"/>
     <w:bookmarkEnd w:id="20"/>
-    <w:bookmarkStart w:id="38" w:name="chapter-2-advanced-topics"/>
+    <w:bookmarkStart w:id="44" w:name="chapter-2-advanced-topics"/>
     <w:p>
       <w:pPr>
         <w:pStyle w:val="Heading1"/>
@@ -1089,13 +1089,379 @@
       </m:oMathPara>
     </w:p>
     <w:bookmarkEnd w:id="21"/>
-    <w:bookmarkStart w:id="23" w:name="tables"/>
+    <w:bookmarkStart w:id="27" w:name="custom-macros"/>
     <w:p>
       <w:pPr>
         <w:pStyle w:val="Heading2"/>
       </w:pPr>
       <w:r>
-        <w:t xml:space="preserve">2.2 Tables</w:t>
+        <w:t xml:space="preserve">2.2 Custom Macros</w:t>
+      </w:r>
+    </w:p>
+    <w:p>
+      <w:pPr>
+        <w:pStyle w:val="FirstParagraph"/>
+      </w:pPr>
+      <w:r>
+        <w:t xml:space="preserve">This book uses the</w:t>
+      </w:r>
+      <w:r>
+        <w:t xml:space="preserve"> </w:t>
+      </w:r>
+      <w:hyperlink r:id="rId22">
+        <w:r>
+          <w:rPr>
+            <w:rStyle w:val="VerbatimChar"/>
+          </w:rPr>
+          <w:t xml:space="preserve">d-morrison/macros</w:t>
+        </w:r>
+      </w:hyperlink>
+      <w:r>
+        <w:t xml:space="preserve"> </w:t>
+      </w:r>
+      <w:r>
+        <w:t xml:space="preserve">submodule to provide convenient LaTeX shorthand for statistical and mathematical notation.</w:t>
+      </w:r>
+    </w:p>
+    <w:bookmarkStart w:id="23" w:name="probability-and-distributions"/>
+    <w:p>
+      <w:pPr>
+        <w:pStyle w:val="Heading3"/>
+      </w:pPr>
+      <w:r>
+        <w:t xml:space="preserve">2.2.1 Probability and Distributions</w:t>
+      </w:r>
+    </w:p>
+    <w:p>
+      <w:pPr>
+        <w:pStyle w:val="FirstParagraph"/>
+      </w:pPr>
+      <w:r>
+        <w:t xml:space="preserve">The normal distribution</w:t>
+      </w:r>
+      <w:r>
+        <w:t xml:space="preserve"> </w:t>
+      </w:r>
+      <w:r>
+        <w:t xml:space="preserve">$\Normal\paren{\m, \ss}$</w:t>
+      </w:r>
+      <w:r>
+        <w:t xml:space="preserve"> </w:t>
+      </w:r>
+      <w:r>
+        <w:t xml:space="preserve">can be written using macros as</w:t>
+      </w:r>
+      <w:r>
+        <w:t xml:space="preserve"> </w:t>
+      </w:r>
+      <w:r>
+        <w:rPr>
+          <w:rStyle w:val="VerbatimChar"/>
+        </w:rPr>
+        <w:t xml:space="preserve">$\Normal\paren{\m, \ss}$</w:t>
+      </w:r>
+      <w:r>
+        <w:t xml:space="preserve">, where</w:t>
+      </w:r>
+      <w:r>
+        <w:t xml:space="preserve"> </w:t>
+      </w:r>
+      <w:r>
+        <w:rPr>
+          <w:rStyle w:val="VerbatimChar"/>
+        </w:rPr>
+        <w:t xml:space="preserve">\m</w:t>
+      </w:r>
+      <w:r>
+        <w:t xml:space="preserve"> </w:t>
+      </w:r>
+      <w:r>
+        <w:t xml:space="preserve">expands to</w:t>
+      </w:r>
+      <w:r>
+        <w:t xml:space="preserve"> </w:t>
+      </w:r>
+      <m:oMath>
+        <m:r>
+          <m:t>μ</m:t>
+        </m:r>
+      </m:oMath>
+      <w:r>
+        <w:t xml:space="preserve"> </w:t>
+      </w:r>
+      <w:r>
+        <w:t xml:space="preserve">and</w:t>
+      </w:r>
+      <w:r>
+        <w:t xml:space="preserve"> </w:t>
+      </w:r>
+      <w:r>
+        <w:rPr>
+          <w:rStyle w:val="VerbatimChar"/>
+        </w:rPr>
+        <w:t xml:space="preserve">\ss</w:t>
+      </w:r>
+      <w:r>
+        <w:t xml:space="preserve"> </w:t>
+      </w:r>
+      <w:r>
+        <w:t xml:space="preserve">expands to</w:t>
+      </w:r>
+      <w:r>
+        <w:t xml:space="preserve"> </w:t>
+      </w:r>
+      <m:oMath>
+        <m:sSup>
+          <m:e>
+            <m:r>
+              <m:t>σ</m:t>
+            </m:r>
+          </m:e>
+          <m:sup>
+            <m:r>
+              <m:t>2</m:t>
+            </m:r>
+          </m:sup>
+        </m:sSup>
+      </m:oMath>
+      <w:r>
+        <w:t xml:space="preserve">.</w:t>
+      </w:r>
+    </w:p>
+    <w:p>
+      <w:pPr>
+        <w:pStyle w:val="BodyText"/>
+      </w:pPr>
+      <w:r>
+        <w:t xml:space="preserve">A random variable</w:t>
+      </w:r>
+      <w:r>
+        <w:t xml:space="preserve"> </w:t>
+      </w:r>
+      <w:r>
+        <w:t xml:space="preserve">$X \dist \Normal\paren{\mu, \sigma^2}$</w:t>
+      </w:r>
+      <w:r>
+        <w:t xml:space="preserve"> </w:t>
+      </w:r>
+      <w:r>
+        <w:t xml:space="preserve">has expectation</w:t>
+      </w:r>
+      <w:r>
+        <w:t xml:space="preserve"> </w:t>
+      </w:r>
+      <w:r>
+        <w:t xml:space="preserve">$\E{X} = \mu$</w:t>
+      </w:r>
+      <w:r>
+        <w:t xml:space="preserve"> </w:t>
+      </w:r>
+      <w:r>
+        <w:t xml:space="preserve">and variance</w:t>
+      </w:r>
+      <w:r>
+        <w:t xml:space="preserve"> </w:t>
+      </w:r>
+      <w:r>
+        <w:t xml:space="preserve">$\Var{X} = \sigma^2$</w:t>
+      </w:r>
+      <w:r>
+        <w:t xml:space="preserve">.</w:t>
+      </w:r>
+    </w:p>
+    <w:bookmarkEnd w:id="23"/>
+    <w:bookmarkStart w:id="24" w:name="regression-notation"/>
+    <w:p>
+      <w:pPr>
+        <w:pStyle w:val="Heading3"/>
+      </w:pPr>
+      <w:r>
+        <w:t xml:space="preserve">2.2.2 Regression Notation</w:t>
+      </w:r>
+    </w:p>
+    <w:p>
+      <w:pPr>
+        <w:pStyle w:val="FirstParagraph"/>
+      </w:pPr>
+      <w:r>
+        <w:t xml:space="preserve">In linear regression, we estimate</w:t>
+      </w:r>
+      <w:r>
+        <w:t xml:space="preserve"> </w:t>
+      </w:r>
+      <w:r>
+        <w:t xml:space="preserve">$\vbeta$</w:t>
+      </w:r>
+      <w:r>
+        <w:t xml:space="preserve"> </w:t>
+      </w:r>
+      <w:r>
+        <w:t xml:space="preserve">using ordinary least squares. The fitted values are</w:t>
+      </w:r>
+      <w:r>
+        <w:t xml:space="preserve"> </w:t>
+      </w:r>
+      <w:r>
+        <w:t xml:space="preserve">$\hy = \mX \hb$</w:t>
+      </w:r>
+      <w:r>
+        <w:t xml:space="preserve">, where</w:t>
+      </w:r>
+      <w:r>
+        <w:t xml:space="preserve"> </w:t>
+      </w:r>
+      <w:r>
+        <w:t xml:space="preserve">$\hb = \inv{\mX' \mX} \mX' \vy$</w:t>
+      </w:r>
+      <w:r>
+        <w:t xml:space="preserve">.</w:t>
+      </w:r>
+    </w:p>
+    <w:p>
+      <w:pPr>
+        <w:pStyle w:val="BodyText"/>
+      </w:pPr>
+      <w:r>
+        <w:t xml:space="preserve">The standard error of</w:t>
+      </w:r>
+      <w:r>
+        <w:t xml:space="preserve"> </w:t>
+      </w:r>
+      <w:r>
+        <w:t xml:space="preserve">$\hb$</w:t>
+      </w:r>
+      <w:r>
+        <w:t xml:space="preserve"> </w:t>
+      </w:r>
+      <w:r>
+        <w:t xml:space="preserve">is</w:t>
+      </w:r>
+      <w:r>
+        <w:t xml:space="preserve"> </w:t>
+      </w:r>
+      <w:r>
+        <w:t xml:space="preserve">$\hse{\hb} = \hs \sqrt{\inv{\mX' \mX}}$</w:t>
+      </w:r>
+      <w:r>
+        <w:t xml:space="preserve">.</w:t>
+      </w:r>
+    </w:p>
+    <w:bookmarkEnd w:id="24"/>
+    <w:bookmarkStart w:id="25" w:name="likelihood-and-estimation"/>
+    <w:p>
+      <w:pPr>
+        <w:pStyle w:val="Heading3"/>
+      </w:pPr>
+      <w:r>
+        <w:t xml:space="preserve">2.2.3 Likelihood and Estimation</w:t>
+      </w:r>
+    </w:p>
+    <w:p>
+      <w:pPr>
+        <w:pStyle w:val="FirstParagraph"/>
+      </w:pPr>
+      <w:r>
+        <w:t xml:space="preserve">The log-likelihood function</w:t>
+      </w:r>
+      <w:r>
+        <w:t xml:space="preserve"> </w:t>
+      </w:r>
+      <w:r>
+        <w:t xml:space="preserve">$\llik(\th)$</w:t>
+      </w:r>
+      <w:r>
+        <w:t xml:space="preserve"> </w:t>
+      </w:r>
+      <w:r>
+        <w:t xml:space="preserve">is maximized at the MLE</w:t>
+      </w:r>
+      <w:r>
+        <w:t xml:space="preserve"> </w:t>
+      </w:r>
+      <w:r>
+        <w:t xml:space="preserve">$\hth_{\text{ML}}$</w:t>
+      </w:r>
+      <w:r>
+        <w:t xml:space="preserve">.</w:t>
+      </w:r>
+    </w:p>
+    <w:p>
+      <w:pPr>
+        <w:pStyle w:val="BodyText"/>
+      </w:pPr>
+      <w:r>
+        <w:t xml:space="preserve">The score function is</w:t>
+      </w:r>
+      <w:r>
+        <w:t xml:space="preserve"> </w:t>
+      </w:r>
+      <w:r>
+        <w:t xml:space="preserve">$\score(\th) = \deriv{\th} \llik(\th)$</w:t>
+      </w:r>
+      <w:r>
+        <w:t xml:space="preserve"> </w:t>
+      </w:r>
+      <w:r>
+        <w:t xml:space="preserve">and the observed information is</w:t>
+      </w:r>
+      <w:r>
+        <w:t xml:space="preserve"> </w:t>
+      </w:r>
+      <w:r>
+        <w:t xml:space="preserve">$\oinf(\th) = -\hess(\th)$</w:t>
+      </w:r>
+      <w:r>
+        <w:t xml:space="preserve">.</w:t>
+      </w:r>
+    </w:p>
+    <w:bookmarkEnd w:id="25"/>
+    <w:bookmarkStart w:id="26" w:name="logistic-regression"/>
+    <w:p>
+      <w:pPr>
+        <w:pStyle w:val="Heading3"/>
+      </w:pPr>
+      <w:r>
+        <w:t xml:space="preserve">2.2.4 Logistic Regression</w:t>
+      </w:r>
+    </w:p>
+    <w:p>
+      <w:pPr>
+        <w:pStyle w:val="FirstParagraph"/>
+      </w:pPr>
+      <w:r>
+        <w:t xml:space="preserve">The logit link function is</w:t>
+      </w:r>
+      <w:r>
+        <w:t xml:space="preserve"> </w:t>
+      </w:r>
+      <w:r>
+        <w:t xml:space="preserve">$\logitf{\pi} = \logt\paren{\frac{\pi}{1 - \pi}}$</w:t>
+      </w:r>
+      <w:r>
+        <w:t xml:space="preserve"> </w:t>
+      </w:r>
+      <w:r>
+        <w:t xml:space="preserve">and its inverse is</w:t>
+      </w:r>
+      <w:r>
+        <w:t xml:space="preserve"> </w:t>
+      </w:r>
+      <w:r>
+        <w:t xml:space="preserve">$\expitf{\eta} = \frac{e^\eta}{1 + e^\eta}$</w:t>
+      </w:r>
+      <w:r>
+        <w:t xml:space="preserve">.</w:t>
+      </w:r>
+    </w:p>
+    <w:bookmarkEnd w:id="26"/>
+    <w:bookmarkEnd w:id="27"/>
+    <w:bookmarkStart w:id="29" w:name="tables"/>
+    <w:p>
+      <w:pPr>
+        <w:pStyle w:val="Heading2"/>
+      </w:pPr>
+      <w:r>
+        <w:t xml:space="preserve">2.3 Tables</w:t>
       </w:r>
     </w:p>
     <w:tbl>
@@ -1111,7 +1477,7 @@
       <w:tr>
         <w:tc>
           <w:tcPr/>
-          <w:bookmarkStart w:id="22" w:name="tbl-example"/>
+          <w:bookmarkStart w:id="28" w:name="tbl-example"/>
           <w:p>
             <w:pPr>
               <w:jc w:val="center"/>
@@ -1254,19 +1620,19 @@
               </w:tc>
             </w:tr>
           </w:tbl>
-          <w:bookmarkEnd w:id="22"/>
+          <w:bookmarkEnd w:id="28"/>
           <w:p/>
         </w:tc>
       </w:tr>
     </w:tbl>
-    <w:bookmarkEnd w:id="23"/>
-    <w:bookmarkStart w:id="24" w:name="figures"/>
+    <w:bookmarkEnd w:id="29"/>
+    <w:bookmarkStart w:id="30" w:name="figures"/>
     <w:p>
       <w:pPr>
         <w:pStyle w:val="Heading2"/>
       </w:pPr>
       <w:r>
-        <w:t xml:space="preserve">2.3 Figures</w:t>
+        <w:t xml:space="preserve">2.4 Figures</w:t>
       </w:r>
     </w:p>
     <w:p>
@@ -1329,14 +1695,14 @@
         <w:t xml:space="preserve">.</w:t>
       </w:r>
     </w:p>
-    <w:bookmarkEnd w:id="24"/>
-    <w:bookmarkStart w:id="37" w:name="callouts"/>
+    <w:bookmarkEnd w:id="30"/>
+    <w:bookmarkStart w:id="43" w:name="callouts"/>
     <w:p>
       <w:pPr>
         <w:pStyle w:val="Heading2"/>
       </w:pPr>
       <w:r>
-        <w:t xml:space="preserve">2.4 Callouts</w:t>
+        <w:t xml:space="preserve">2.5 Callouts</w:t>
       </w:r>
     </w:p>
     <w:tbl>
@@ -1380,18 +1746,18 @@
                 <wp:inline>
                   <wp:extent cx="152400" cy="152400"/>
                   <wp:effectExtent b="0" l="0" r="0" t="0"/>
-                  <wp:docPr descr="" title="" id="26" name="Picture"/>
+                  <wp:docPr descr="" title="" id="32" name="Picture"/>
                   <a:graphic>
                     <a:graphicData uri="http://schemas.openxmlformats.org/drawingml/2006/picture">
                       <pic:pic>
                         <pic:nvPicPr>
-                          <pic:cNvPr descr="/opt/quarto/share/formats/docx/note.png" id="27" name="Picture"/>
+                          <pic:cNvPr descr="/opt/quarto/share/formats/docx/note.png" id="33" name="Picture"/>
                           <pic:cNvPicPr>
                             <a:picLocks noChangeArrowheads="1" noChangeAspect="1"/>
                           </pic:cNvPicPr>
                         </pic:nvPicPr>
                         <pic:blipFill>
-                          <a:blip r:embed="rId25"/>
+                          <a:blip r:embed="rId31"/>
                           <a:stretch>
                             <a:fillRect/>
                           </a:stretch>
@@ -1504,18 +1870,18 @@
                 <wp:inline>
                   <wp:extent cx="152400" cy="152400"/>
                   <wp:effectExtent b="0" l="0" r="0" t="0"/>
-                  <wp:docPr descr="" title="" id="29" name="Picture"/>
+                  <wp:docPr descr="" title="" id="35" name="Picture"/>
                   <a:graphic>
                     <a:graphicData uri="http://schemas.openxmlformats.org/drawingml/2006/picture">
                       <pic:pic>
                         <pic:nvPicPr>
-                          <pic:cNvPr descr="/opt/quarto/share/formats/docx/tip.png" id="30" name="Picture"/>
+                          <pic:cNvPr descr="/opt/quarto/share/formats/docx/tip.png" id="36" name="Picture"/>
                           <pic:cNvPicPr>
                             <a:picLocks noChangeArrowheads="1" noChangeAspect="1"/>
                           </pic:cNvPicPr>
                         </pic:nvPicPr>
                         <pic:blipFill>
-                          <a:blip r:embed="rId28"/>
+                          <a:blip r:embed="rId34"/>
                           <a:stretch>
                             <a:fillRect/>
                           </a:stretch>
@@ -1628,18 +1994,18 @@
                 <wp:inline>
                   <wp:extent cx="152400" cy="152400"/>
                   <wp:effectExtent b="0" l="0" r="0" t="0"/>
-                  <wp:docPr descr="" title="" id="32" name="Picture"/>
+                  <wp:docPr descr="" title="" id="38" name="Picture"/>
                   <a:graphic>
                     <a:graphicData uri="http://schemas.openxmlformats.org/drawingml/2006/picture">
                       <pic:pic>
                         <pic:nvPicPr>
-                          <pic:cNvPr descr="/opt/quarto/share/formats/docx/warning.png" id="33" name="Picture"/>
+                          <pic:cNvPr descr="/opt/quarto/share/formats/docx/warning.png" id="39" name="Picture"/>
                           <pic:cNvPicPr>
                             <a:picLocks noChangeArrowheads="1" noChangeAspect="1"/>
                           </pic:cNvPicPr>
                         </pic:nvPicPr>
                         <pic:blipFill>
-                          <a:blip r:embed="rId31"/>
+                          <a:blip r:embed="rId37"/>
                           <a:stretch>
                             <a:fillRect/>
                           </a:stretch>
@@ -1752,18 +2118,18 @@
                 <wp:inline>
                   <wp:extent cx="152400" cy="152400"/>
                   <wp:effectExtent b="0" l="0" r="0" t="0"/>
-                  <wp:docPr descr="" title="" id="35" name="Picture"/>
+                  <wp:docPr descr="" title="" id="41" name="Picture"/>
                   <a:graphic>
                     <a:graphicData uri="http://schemas.openxmlformats.org/drawingml/2006/picture">
                       <pic:pic>
                         <pic:nvPicPr>
-                          <pic:cNvPr descr="/opt/quarto/share/formats/docx/important.png" id="36" name="Picture"/>
+                          <pic:cNvPr descr="/opt/quarto/share/formats/docx/important.png" id="42" name="Picture"/>
                           <pic:cNvPicPr>
                             <a:picLocks noChangeArrowheads="1" noChangeAspect="1"/>
                           </pic:cNvPicPr>
                         </pic:nvPicPr>
                         <pic:blipFill>
-                          <a:blip r:embed="rId34"/>
+                          <a:blip r:embed="rId40"/>
                           <a:stretch>
                             <a:fillRect/>
                           </a:stretch>
@@ -1827,9 +2193,9 @@
         </w:tc>
       </w:tr>
     </w:tbl>
-    <w:bookmarkEnd w:id="37"/>
-    <w:bookmarkEnd w:id="38"/>
-    <w:bookmarkStart w:id="40" w:name="references"/>
+    <w:bookmarkEnd w:id="43"/>
+    <w:bookmarkEnd w:id="44"/>
+    <w:bookmarkStart w:id="46" w:name="references"/>
     <w:p>
       <w:pPr>
         <w:pStyle w:val="Heading1"/>
@@ -1838,9 +2204,9 @@
         <w:t xml:space="preserve">References</w:t>
       </w:r>
     </w:p>
-    <w:bookmarkStart w:id="39" w:name="refs"/>
-    <w:bookmarkEnd w:id="39"/>
-    <w:bookmarkEnd w:id="40"/>
+    <w:bookmarkStart w:id="45" w:name="refs"/>
+    <w:bookmarkEnd w:id="45"/>
+    <w:bookmarkEnd w:id="46"/>
     <w:sectPr>
       <w:footnotePr>
         <w:numRestart w:val="eachSect"/>

</xml_diff>

<commit_message>
Deploying to gh-pages from @ UCD-SERG/qbt@fc76047e79a10c975985d3520b1f748b67659334 🚀
</commit_message>
<xml_diff>
--- a/Your-Book-Title.docx
+++ b/Your-Book-Title.docx
@@ -2207,6 +2207,126 @@
     <w:bookmarkStart w:id="45" w:name="refs"/>
     <w:bookmarkEnd w:id="45"/>
     <w:bookmarkEnd w:id="46"/>
+    <w:bookmarkStart w:id="47" w:name="document-generation-metadata"/>
+    <w:p>
+      <w:pPr>
+        <w:pStyle w:val="Heading1"/>
+      </w:pPr>
+      <w:r>
+        <w:t xml:space="preserve">Document Generation Metadata</w:t>
+      </w:r>
+    </w:p>
+    <w:p>
+      <w:pPr>
+        <w:pStyle w:val="FirstParagraph"/>
+      </w:pPr>
+      <w:r>
+        <w:t xml:space="preserve">This document was generated from the following git commit:</w:t>
+      </w:r>
+    </w:p>
+    <w:p>
+      <w:pPr>
+        <w:pStyle w:val="Compact"/>
+        <w:numPr>
+          <w:ilvl w:val="0"/>
+          <w:numId w:val="1004"/>
+        </w:numPr>
+      </w:pPr>
+      <w:r>
+        <w:rPr>
+          <w:b/>
+          <w:bCs/>
+        </w:rPr>
+        <w:t xml:space="preserve">Branch:</w:t>
+      </w:r>
+      <w:r>
+        <w:t xml:space="preserve"> </w:t>
+      </w:r>
+      <w:r>
+        <w:t xml:space="preserve">main</w:t>
+      </w:r>
+    </w:p>
+    <w:p>
+      <w:pPr>
+        <w:pStyle w:val="Compact"/>
+        <w:numPr>
+          <w:ilvl w:val="0"/>
+          <w:numId w:val="1004"/>
+        </w:numPr>
+      </w:pPr>
+      <w:r>
+        <w:rPr>
+          <w:b/>
+          <w:bCs/>
+        </w:rPr>
+        <w:t xml:space="preserve">Commit:</w:t>
+      </w:r>
+      <w:r>
+        <w:t xml:space="preserve"> </w:t>
+      </w:r>
+      <w:r>
+        <w:t xml:space="preserve">fc76047</w:t>
+      </w:r>
+    </w:p>
+    <w:p>
+      <w:pPr>
+        <w:pStyle w:val="Compact"/>
+        <w:numPr>
+          <w:ilvl w:val="0"/>
+          <w:numId w:val="1004"/>
+        </w:numPr>
+      </w:pPr>
+      <w:r>
+        <w:rPr>
+          <w:b/>
+          <w:bCs/>
+        </w:rPr>
+        <w:t xml:space="preserve">Full commit hash:</w:t>
+      </w:r>
+      <w:r>
+        <w:t xml:space="preserve"> </w:t>
+      </w:r>
+      <w:r>
+        <w:t xml:space="preserve">fc76047e79a10c975985d3520b1f748b67659334</w:t>
+      </w:r>
+    </w:p>
+    <w:p>
+      <w:pPr>
+        <w:pStyle w:val="Compact"/>
+        <w:numPr>
+          <w:ilvl w:val="0"/>
+          <w:numId w:val="1004"/>
+        </w:numPr>
+      </w:pPr>
+      <w:r>
+        <w:rPr>
+          <w:b/>
+          <w:bCs/>
+        </w:rPr>
+        <w:t xml:space="preserve">Commit date:</w:t>
+      </w:r>
+      <w:r>
+        <w:t xml:space="preserve"> </w:t>
+      </w:r>
+      <w:r>
+        <w:t xml:space="preserve">2026-05-08 15:46:53 -0700</w:t>
+      </w:r>
+    </w:p>
+    <w:p>
+      <w:pPr>
+        <w:pStyle w:val="FirstParagraph"/>
+      </w:pPr>
+      <w:r>
+        <w:t xml:space="preserve">When transferring edits from this document back to the Quarto source files,</w:t>
+      </w:r>
+      <w:r>
+        <w:t xml:space="preserve"> </w:t>
+      </w:r>
+      <w:r>
+        <w:t xml:space="preserve">use this commit information to set up the PR correctly and account for any commits that have been added since this document was generated.</w:t>
+      </w:r>
+    </w:p>
+    <w:bookmarkEnd w:id="47"/>
     <w:sectPr>
       <w:footnotePr>
         <w:numRestart w:val="eachSect"/>
@@ -2569,6 +2689,9 @@
     </w:lvlOverride>
   </w:num>
   <w:num w:numId="1003">
+    <w:abstractNumId w:val="991"/>
+  </w:num>
+  <w:num w:numId="1004">
     <w:abstractNumId w:val="991"/>
   </w:num>
 </w:numbering>

</xml_diff>

<commit_message>
Deploying to gh-pages from @ d-morrison/qbt@f7f86e111ee1fff58575a4236a35780237ea784c 🚀
</commit_message>
<xml_diff>
--- a/Your-Book-Title.docx
+++ b/Your-Book-Title.docx
@@ -23,7 +23,7 @@
         <w:pStyle w:val="Date"/>
       </w:pPr>
       <w:r>
-        <w:t xml:space="preserve">Last updated: 2026-05-08</w:t>
+        <w:t xml:space="preserve">Last updated: 2026-05-19</w:t>
       </w:r>
     </w:p>
     <w:bookmarkStart w:id="15" w:name="welcome"/>
@@ -2265,7 +2265,7 @@
         <w:t xml:space="preserve"> </w:t>
       </w:r>
       <w:r>
-        <w:t xml:space="preserve">fc76047</w:t>
+        <w:t xml:space="preserve">f7f86e1</w:t>
       </w:r>
     </w:p>
     <w:p>
@@ -2287,7 +2287,7 @@
         <w:t xml:space="preserve"> </w:t>
       </w:r>
       <w:r>
-        <w:t xml:space="preserve">fc76047e79a10c975985d3520b1f748b67659334</w:t>
+        <w:t xml:space="preserve">f7f86e111ee1fff58575a4236a35780237ea784c</w:t>
       </w:r>
     </w:p>
     <w:p>
@@ -2309,7 +2309,7 @@
         <w:t xml:space="preserve"> </w:t>
       </w:r>
       <w:r>
-        <w:t xml:space="preserve">2026-05-08 15:46:53 -0700</w:t>
+        <w:t xml:space="preserve">2026-05-18 18:22:21 -0700</w:t>
       </w:r>
     </w:p>
     <w:p>

</xml_diff>

<commit_message>
Deploying to gh-pages from @ d-morrison/qbt@bc5d7cded6c1348f53eb32ec5d445a02daf16b07 🚀
</commit_message>
<xml_diff>
--- a/Your-Book-Title.docx
+++ b/Your-Book-Title.docx
@@ -23,7 +23,7 @@
         <w:pStyle w:val="Date"/>
       </w:pPr>
       <w:r>
-        <w:t xml:space="preserve">Last updated: 2026-05-19</w:t>
+        <w:t xml:space="preserve">Last updated: 2026-06-26</w:t>
       </w:r>
     </w:p>
     <w:bookmarkStart w:id="15" w:name="welcome"/>
@@ -2265,7 +2265,7 @@
         <w:t xml:space="preserve"> </w:t>
       </w:r>
       <w:r>
-        <w:t xml:space="preserve">f7f86e1</w:t>
+        <w:t xml:space="preserve">bc5d7cd</w:t>
       </w:r>
     </w:p>
     <w:p>
@@ -2287,7 +2287,7 @@
         <w:t xml:space="preserve"> </w:t>
       </w:r>
       <w:r>
-        <w:t xml:space="preserve">f7f86e111ee1fff58575a4236a35780237ea784c</w:t>
+        <w:t xml:space="preserve">bc5d7cded6c1348f53eb32ec5d445a02daf16b07</w:t>
       </w:r>
     </w:p>
     <w:p>
@@ -2309,7 +2309,7 @@
         <w:t xml:space="preserve"> </w:t>
       </w:r>
       <w:r>
-        <w:t xml:space="preserve">2026-05-18 18:22:21 -0700</w:t>
+        <w:t xml:space="preserve">2026-06-26 16:19:55 -0700</w:t>
       </w:r>
     </w:p>
     <w:p>

</xml_diff>

<commit_message>
Deploying to gh-pages from @ d-morrison/qbt@e36243f4c9d49164002b1996c84b1b3e575ec925 🚀
</commit_message>
<xml_diff>
--- a/Your-Book-Title.docx
+++ b/Your-Book-Title.docx
@@ -23,7 +23,7 @@
         <w:pStyle w:val="Date"/>
       </w:pPr>
       <w:r>
-        <w:t xml:space="preserve">Last updated: 2026-06-26</w:t>
+        <w:t xml:space="preserve">Last updated: 2026-06-27</w:t>
       </w:r>
     </w:p>
     <w:bookmarkStart w:id="15" w:name="welcome"/>
@@ -2265,7 +2265,7 @@
         <w:t xml:space="preserve"> </w:t>
       </w:r>
       <w:r>
-        <w:t xml:space="preserve">bc5d7cd</w:t>
+        <w:t xml:space="preserve">e36243f</w:t>
       </w:r>
     </w:p>
     <w:p>
@@ -2287,7 +2287,7 @@
         <w:t xml:space="preserve"> </w:t>
       </w:r>
       <w:r>
-        <w:t xml:space="preserve">bc5d7cded6c1348f53eb32ec5d445a02daf16b07</w:t>
+        <w:t xml:space="preserve">e36243f4c9d49164002b1996c84b1b3e575ec925</w:t>
       </w:r>
     </w:p>
     <w:p>
@@ -2309,7 +2309,7 @@
         <w:t xml:space="preserve"> </w:t>
       </w:r>
       <w:r>
-        <w:t xml:space="preserve">2026-06-26 16:19:55 -0700</w:t>
+        <w:t xml:space="preserve">2026-06-26 17:21:57 -0700</w:t>
       </w:r>
     </w:p>
     <w:p>

</xml_diff>

<commit_message>
Deploying to gh-pages from @ d-morrison/qbt@a1c39fb89fc9f5b2810578ddb3be9b42dee6b1b6 🚀
</commit_message>
<xml_diff>
--- a/Your-Book-Title.docx
+++ b/Your-Book-Title.docx
@@ -23,7 +23,7 @@
         <w:pStyle w:val="Date"/>
       </w:pPr>
       <w:r>
-        <w:t xml:space="preserve">Last updated: 2026-06-27</w:t>
+        <w:t xml:space="preserve">Last updated: 2026-07-21</w:t>
       </w:r>
     </w:p>
     <w:bookmarkStart w:id="15" w:name="welcome"/>
@@ -2265,7 +2265,7 @@
         <w:t xml:space="preserve"> </w:t>
       </w:r>
       <w:r>
-        <w:t xml:space="preserve">e36243f</w:t>
+        <w:t xml:space="preserve">a1c39fb</w:t>
       </w:r>
     </w:p>
     <w:p>
@@ -2287,7 +2287,7 @@
         <w:t xml:space="preserve"> </w:t>
       </w:r>
       <w:r>
-        <w:t xml:space="preserve">e36243f4c9d49164002b1996c84b1b3e575ec925</w:t>
+        <w:t xml:space="preserve">a1c39fb89fc9f5b2810578ddb3be9b42dee6b1b6</w:t>
       </w:r>
     </w:p>
     <w:p>
@@ -2309,7 +2309,7 @@
         <w:t xml:space="preserve"> </w:t>
       </w:r>
       <w:r>
-        <w:t xml:space="preserve">2026-06-26 17:21:57 -0700</w:t>
+        <w:t xml:space="preserve">2026-07-21 11:20:14 -0700</w:t>
       </w:r>
     </w:p>
     <w:p>

</xml_diff>

<commit_message>
Deploying to gh-pages from @ d-morrison/qbt@9d89fe63c1e91a6d369cdecd89bbfcbfb3df7e4d 🚀
</commit_message>
<xml_diff>
--- a/Your-Book-Title.docx
+++ b/Your-Book-Title.docx
@@ -23,7 +23,7 @@
         <w:pStyle w:val="Date"/>
       </w:pPr>
       <w:r>
-        <w:t xml:space="preserve">Last updated: 2026-07-21</w:t>
+        <w:t xml:space="preserve">Last updated: 2026-07-29</w:t>
       </w:r>
     </w:p>
     <w:bookmarkStart w:id="15" w:name="welcome"/>
@@ -2265,7 +2265,7 @@
         <w:t xml:space="preserve"> </w:t>
       </w:r>
       <w:r>
-        <w:t xml:space="preserve">a1c39fb</w:t>
+        <w:t xml:space="preserve">9d89fe6</w:t>
       </w:r>
     </w:p>
     <w:p>
@@ -2287,7 +2287,7 @@
         <w:t xml:space="preserve"> </w:t>
       </w:r>
       <w:r>
-        <w:t xml:space="preserve">a1c39fb89fc9f5b2810578ddb3be9b42dee6b1b6</w:t>
+        <w:t xml:space="preserve">9d89fe63c1e91a6d369cdecd89bbfcbfb3df7e4d</w:t>
       </w:r>
     </w:p>
     <w:p>
@@ -2309,7 +2309,7 @@
         <w:t xml:space="preserve"> </w:t>
       </w:r>
       <w:r>
-        <w:t xml:space="preserve">2026-07-21 11:20:14 -0700</w:t>
+        <w:t xml:space="preserve">2026-07-29 13:08:00 -0700</w:t>
       </w:r>
     </w:p>
     <w:p>

</xml_diff>

<commit_message>
Deploying to gh-pages from @ d-morrison/qbt@b06c9f1890e5f9e9d10fcd0fd33669b27c1166eb 🚀
</commit_message>
<xml_diff>
--- a/Your-Book-Title.docx
+++ b/Your-Book-Title.docx
@@ -2265,7 +2265,7 @@
         <w:t xml:space="preserve"> </w:t>
       </w:r>
       <w:r>
-        <w:t xml:space="preserve">9d89fe6</w:t>
+        <w:t xml:space="preserve">b06c9f1</w:t>
       </w:r>
     </w:p>
     <w:p>
@@ -2287,7 +2287,7 @@
         <w:t xml:space="preserve"> </w:t>
       </w:r>
       <w:r>
-        <w:t xml:space="preserve">9d89fe63c1e91a6d369cdecd89bbfcbfb3df7e4d</w:t>
+        <w:t xml:space="preserve">b06c9f1890e5f9e9d10fcd0fd33669b27c1166eb</w:t>
       </w:r>
     </w:p>
     <w:p>
@@ -2309,7 +2309,7 @@
         <w:t xml:space="preserve"> </w:t>
       </w:r>
       <w:r>
-        <w:t xml:space="preserve">2026-07-29 13:08:00 -0700</w:t>
+        <w:t xml:space="preserve">2026-07-29 13:08:31 -0700</w:t>
       </w:r>
     </w:p>
     <w:p>

</xml_diff>

<commit_message>
Deploying to gh-pages from @ d-morrison/qbt@5e32aca1d48c891e3e17b882c10dda1f7eae0f0a 🚀
</commit_message>
<xml_diff>
--- a/Your-Book-Title.docx
+++ b/Your-Book-Title.docx
@@ -23,7 +23,7 @@
         <w:pStyle w:val="Date"/>
       </w:pPr>
       <w:r>
-        <w:t xml:space="preserve">Last updated: 2026-07-29</w:t>
+        <w:t xml:space="preserve">Last updated: 2026-07-31</w:t>
       </w:r>
     </w:p>
     <w:bookmarkStart w:id="15" w:name="welcome"/>
@@ -2265,7 +2265,7 @@
         <w:t xml:space="preserve"> </w:t>
       </w:r>
       <w:r>
-        <w:t xml:space="preserve">b06c9f1</w:t>
+        <w:t xml:space="preserve">5e32aca</w:t>
       </w:r>
     </w:p>
     <w:p>
@@ -2287,7 +2287,7 @@
         <w:t xml:space="preserve"> </w:t>
       </w:r>
       <w:r>
-        <w:t xml:space="preserve">b06c9f1890e5f9e9d10fcd0fd33669b27c1166eb</w:t>
+        <w:t xml:space="preserve">5e32aca1d48c891e3e17b882c10dda1f7eae0f0a</w:t>
       </w:r>
     </w:p>
     <w:p>
@@ -2309,7 +2309,7 @@
         <w:t xml:space="preserve"> </w:t>
       </w:r>
       <w:r>
-        <w:t xml:space="preserve">2026-07-29 13:08:31 -0700</w:t>
+        <w:t xml:space="preserve">2026-07-31 10:00:37 -0700</w:t>
       </w:r>
     </w:p>
     <w:p>

</xml_diff>